<commit_message>
auto: XHS cards — 2026-08-12
</commit_message>
<xml_diff>
--- a/docs/xhs/2026-08-11/历史故事/发布文案.docx
+++ b/docs/xhs/2026-08-11/历史故事/发布文案.docx
@@ -11,7 +11,7 @@
         <w:rPr>
           <w:color w:val="CC3333"/>
         </w:rPr>
-        <w:t>想变通透？看这10个故事就够了</w:t>
+        <w:t>所有历史迷！把这10个真相焊脑子里！</w:t>
       </w:r>
     </w:p>
     <w:p>
@@ -40,22 +40,19 @@
         <w:spacing w:line="384" w:lineRule="auto"/>
       </w:pPr>
       <w:r>
-        <w:t>你知道吗？世界上最早的太阳黑子记录，是西汉人用“钱”来比喻大小的——“大如钱，居日中央”。🤯</w:t>
+        <w:t>《三国演义》里张飞怒鞭督邮，其实是刘备干的！🔥 正史记载，刘备当县尉时被督邮刁难，一怒之下把人绑起来打了二百杖，挂印弃官跑路——莽还是你刘皇叔莽。</w:t>
         <w:br/>
         <w:br/>
-        <w:t>古人没望远镜，却硬核到给星星扫帚取名“星孛”，还给风力分了十级。李淳风在《乙巳占》里靠看树叶摇、瓦片飞定级，比欧洲早了一千多年。🔥</w:t>
+        <w:t>这就是历史的魔幻之处，我们以为的“常识”，可能只是小说家写的爽文。📖 朱元璋给开国功臣发免死金牌“丹书铁券”，许诺“恕九死”，结果拿到铁券的三十四人里，绝大多数都被他以谋反罪处死，包括李善长、蓝玉。所谓免死，不过是皇帝一句话的事，铁券比纸还薄。💔</w:t>
         <w:br/>
         <w:br/>
-        <w:t>更绝的是春秋的孙叔敖，修了百里的芍陂灌溉万顷田，还给渠道定制了一条规矩：永不收水税。他把水利修成了跨越千年的公益工程。💧</w:t>
+        <w:t>古人打仗也全是心眼子。⚔️ 唐朝名将李愬雪夜奇袭蔡州，专挑最冷的暴雪天急行军六十里，旌旗冻裂、人马冻死都不停，一头扎进叛军老巢，活捉敌首。这就是“示弱+天气”双重烟雾弹，直接把敌人打懵。🤯 南朝宋的檀道济更绝，军粮被叛徒泄露给北魏，他反手用沙子冒充米，在营里高调唱筹量沙，魏军以为宋军粮草充足，愣是没敢进攻。心理战玩到这个地步，奥斯卡欠他们一座小金人。🏆</w:t>
         <w:br/>
         <w:br/>
-        <w:t>而檀道济在断粮时，连夜用沙子堆成米山，盖一层真米，让士兵慢悠悠“唱筹量沙”，敌军直接看懵，以为粮草充足不敢追击。虚张声势玩到这种境界，心理战的神。⚔️</w:t>
+        <w:t>历史从来不是课本上干巴巴的年份，而是一群会怕、会莽、会耍心眼的真人。金句来了✨：“演义负责造神，正史负责打脸，合在一起才叫人间清醒。”</w:t>
         <w:br/>
         <w:br/>
-        <w:t>这些故事没一个在说教，却句句都在提醒我们：真正的聪明，是把一件事做到极致，或者把困局盘成活路。穿越回去，你想偷师哪种手艺？</w:t>
-        <w:br/>
-        <w:br/>
-        <w:t>#历史故事 #国学智慧 #冷知识 #古人智慧 #认知升级 #格局打开 #每天学点历史</w:t>
+        <w:t>你还被哪个历史“常识”骗了很久？评论区交出你的故事，一起破案！👇</w:t>
       </w:r>
     </w:p>
     <w:p>
@@ -71,7 +68,7 @@
         <w:rPr>
           <w:color w:val="CC3333"/>
         </w:rPr>
-        <w:t>#历史故事  #国学智慧  #冷知识  #古人智慧  #认知升级  #格局打开  #每天学点历史</w:t>
+        <w:t>#历史故事  #国学智慧  #古人智慧  #冷知识  #每天学点历史  #传统文化  #认知升级  #格局打开</w:t>
       </w:r>
     </w:p>
     <w:p>
@@ -88,7 +85,7 @@
           <w:b/>
           <w:sz w:val="32"/>
         </w:rPr>
-        <w:t>古人开挂实录</w:t>
+        <w:t>认知炸裂</w:t>
       </w:r>
     </w:p>
     <w:p>
@@ -107,7 +104,7 @@
         <w:rPr>
           <w:sz w:val="24"/>
         </w:rPr>
-        <w:t>#1  春秋 · 星孛入北斗：最早的哈雷彗星记录  [古代天文地理]</w:t>
+        <w:t>#1  南宋 · 苏州石刻天文图  [古代天文地理]</w:t>
       </w:r>
     </w:p>
     <w:p>
@@ -115,7 +112,7 @@
         <w:spacing w:line="336" w:lineRule="auto"/>
       </w:pPr>
       <w:r>
-        <w:t>💡 古人严谨的天象记录，无意中为现代科学提供了跨越千年的观测数据。看似无用的记录，可能在时间长河中焕发巨大的科学价值。</w:t>
+        <w:t>💡 科学观测与艺术镌刻的结合，传递的不仅是精准的星象知识，更寄托了古人天人相应的治国理念。</w:t>
       </w:r>
     </w:p>
     <w:p/>
@@ -127,7 +124,7 @@
         <w:rPr>
           <w:sz w:val="24"/>
         </w:rPr>
-        <w:t>#2  西汉 · 日中有黑气：最早的太阳黑子记录  [古代天文地理]</w:t>
+        <w:t>#2  元 · 扎马鲁丁造地球仪  [古代天文地理]</w:t>
       </w:r>
     </w:p>
     <w:p>
@@ -135,7 +132,7 @@
         <w:spacing w:line="336" w:lineRule="auto"/>
       </w:pPr>
       <w:r>
-        <w:t>💡 自然界的一切异常都值得如实记录，哪怕一时无法解释，严谨的态度也能让片段成为未来解开宇宙奥秘的钥匙。</w:t>
+        <w:t>💡 不同文明的交流互鉴往往能催生新知，开放包容的胸怀是科技进步的重要土壤。</w:t>
       </w:r>
     </w:p>
     <w:p/>
@@ -147,7 +144,7 @@
         <w:rPr>
           <w:sz w:val="24"/>
         </w:rPr>
-        <w:t>#3  唐 · 李淳风定风力等级  [古代天文地理]</w:t>
+        <w:t>#3  隋 · 刘焯创制皇极历  [古代天文地理]</w:t>
       </w:r>
     </w:p>
     <w:p>
@@ -155,7 +152,7 @@
         <w:spacing w:line="336" w:lineRule="auto"/>
       </w:pPr>
       <w:r>
-        <w:t>💡 科学有时诞生于看似迷信的实践中，只要善于观察、归纳和定量化描述，传统经验也能率先触摸到自然规律的门槛。</w:t>
+        <w:t>💡 真理有时会被埋没，但经得起时间考验的科学发现终将照亮后世。</w:t>
       </w:r>
     </w:p>
     <w:p/>
@@ -167,7 +164,7 @@
         <w:rPr>
           <w:sz w:val="24"/>
         </w:rPr>
-        <w:t>#4  春秋 · 孙叔敖修芍陂：无税的水利丰碑  [古代天文地理]</w:t>
+        <w:t>#4  东汉 · 甘英望大秦  [古代天文地理]</w:t>
       </w:r>
     </w:p>
     <w:p>
@@ -175,7 +172,7 @@
         <w:spacing w:line="336" w:lineRule="auto"/>
       </w:pPr>
       <w:r>
-        <w:t>💡 真正的功业不是为自己积攒财富，而是为百姓种下一片能长久受益的绿荫。水利工程如此，为官之德亦如此。</w:t>
+        <w:t>💡 虽因人为阻挠未达目的地，但探索的脚步本身已拓展了整个民族的地理视野。</w:t>
       </w:r>
     </w:p>
     <w:p/>
@@ -187,7 +184,7 @@
         <w:rPr>
           <w:sz w:val="24"/>
         </w:rPr>
-        <w:t>#5  隋 · 隋炀帝开凿大运河  [古代天文地理]</w:t>
+        <w:t>#5  唐 · 杜环与《经行记》  [古代天文地理]</w:t>
       </w:r>
     </w:p>
     <w:p>
@@ -195,7 +192,7 @@
         <w:spacing w:line="336" w:lineRule="auto"/>
       </w:pPr>
       <w:r>
-        <w:t>💡 评判一项大型工程，不能只看建设时的痛苦，也要看它给后世带来的长远福祉。历史的天平上，功过常常需要更持久的时间来衡量。</w:t>
+        <w:t>💡 不幸的遭际有时却意外打开一扇认知世界的窗户，漂泊的步履也能为文明交流架桥。</w:t>
       </w:r>
     </w:p>
     <w:p/>
@@ -207,7 +204,7 @@
         <w:rPr>
           <w:sz w:val="24"/>
         </w:rPr>
-        <w:t>#6  东汉 · 马臻修鉴湖：牺牲豪强的水利  [古代天文地理]</w:t>
+        <w:t>#6  元 · 汪大渊踏浪著《岛夷志略》  [古代天文地理]</w:t>
       </w:r>
     </w:p>
     <w:p>
@@ -215,7 +212,7 @@
         <w:spacing w:line="336" w:lineRule="auto"/>
       </w:pPr>
       <w:r>
-        <w:t>💡 为众人抱薪者，有时反被利益受损的权势者扼杀。但民心自有秤，真正造福一方的官员，即使被冤杀也会活在百姓世代相传的记忆里。</w:t>
+        <w:t>💡 真正的知识来自亲历亲闻，汪大渊用半生漂泊证明了“纸上得来终觉浅”。</w:t>
       </w:r>
     </w:p>
     <w:p/>
@@ -227,7 +224,7 @@
         <w:rPr>
           <w:sz w:val="24"/>
         </w:rPr>
-        <w:t>#7  东晋 · 祖逖闻鸡起舞  [历史故事]</w:t>
+        <w:t>#7  东汉 · 刘备鞭督邮  [历史趣考]</w:t>
       </w:r>
     </w:p>
     <w:p>
@@ -235,7 +232,7 @@
         <w:spacing w:line="336" w:lineRule="auto"/>
       </w:pPr>
       <w:r>
-        <w:t>💡 真正的志向，经得起黎明前的黑暗和睡意的考验。抓住每一个看似不值得的瞬间奋起，日积月累，才能在国家需要时挺身而出。</w:t>
+        <w:t>💡 演义与正史有别，不唯书本论，才能还原更立体真实的历史人物。</w:t>
       </w:r>
     </w:p>
     <w:p/>
@@ -247,7 +244,7 @@
         <w:rPr>
           <w:sz w:val="24"/>
         </w:rPr>
-        <w:t>#8  新莽/东汉 · 刘秀昆阳之战：以少胜多光复汉家  [历史故事]</w:t>
+        <w:t>#8  明 · 丹书铁券不免死  [历史趣考]</w:t>
       </w:r>
     </w:p>
     <w:p>
@@ -255,7 +252,7 @@
         <w:spacing w:line="336" w:lineRule="auto"/>
       </w:pPr>
       <w:r>
-        <w:t>💡 困境中最需要冷静的头脑和决绝的勇气。只要不放弃，哪怕兵力悬殊，也能抓住一丝战机，以小博大，扭转乾坤。</w:t>
+        <w:t>💡 特权若完全依赖于君王的意志，便如同一纸空文，法治才是保障承诺的根本。</w:t>
       </w:r>
     </w:p>
     <w:p/>
@@ -267,7 +264,7 @@
         <w:rPr>
           <w:sz w:val="24"/>
         </w:rPr>
-        <w:t>#9  东汉 · 虞诩增灶示强破羌兵  [兵法谋略故事]</w:t>
+        <w:t>#9  唐 · 李愬雪夜入蔡州  [兵法谋略]</w:t>
       </w:r>
     </w:p>
     <w:p>
@@ -275,7 +272,7 @@
         <w:spacing w:line="336" w:lineRule="auto"/>
       </w:pPr>
       <w:r>
-        <w:t>💡 兵法不是死板的公式，孙膑减灶是示弱诱敌，虞诩增灶是示强阻敌，情况不同，策略也应随之而变。懂得变通，才是活的谋略。</w:t>
+        <w:t>💡 奇袭贵在出其不意，示弱于敌和恶劣天气都可能成为出奇制胜的良机。</w:t>
       </w:r>
     </w:p>
     <w:p/>
@@ -287,7 +284,7 @@
         <w:rPr>
           <w:sz w:val="24"/>
         </w:rPr>
-        <w:t>#10  南朝宋 · 檀道济唱筹量沙  [兵法谋略故事]</w:t>
+        <w:t>#10  南朝宋 · 檀道济唱筹量沙  [兵法谋略]</w:t>
       </w:r>
     </w:p>
     <w:p>
@@ -295,7 +292,7 @@
         <w:spacing w:line="336" w:lineRule="auto"/>
       </w:pPr>
       <w:r>
-        <w:t>💡 最危急的时刻，虚虚实实的心理战往往比真刀真枪更有效。即使在败退中，用智慧和镇定展现从容，也能唬住追兵，化险为夷。</w:t>
+        <w:t>💡 兵不厌诈，心理战往往能逆转绝境，虚虚实实令敌不敢轻举妄动。</w:t>
       </w:r>
     </w:p>
     <w:p/>

</xml_diff>